<commit_message>
feat(dao): avis specifique aligne sur un avis reel (arbitrage du pilote du 30/09) : en-tete Republique / devise / autorite / PRMP / UGPM, numero seul, lieu et date au bas, paragraphes numerotes ({{NUM}}), guillemets, adresse de consultation avec libelles, montant du DAO par lot, « garantie non requise », supports facultatifs ; decalques 91/91 et 97/97 ; demande backend §B7 ; modale : numero du JMP et supports facultatifs
Co-Authored-By: Claude Opus 5.5 (1M context) <noreply@anthropic.com>
</commit_message>
<xml_diff>
--- a/docs/modeles-dao/AVIS-F.docx
+++ b/docs/modeles-dao/AVIS-F.docx
@@ -25,6 +25,32 @@
           <w:b w:val="off"/>
           <w:sz w:val="22"/>
         </w:rPr>
+        <w:t>REPOBLIKAN’I MADAGASIKARA</w:t>
+      </w:r>
+    </w:p>
+    <w:p>
+      <w:pPr>
+        <w:spacing w:after="120"/>
+        <w:jc w:val="center"/>
+      </w:pPr>
+      <w:r>
+        <w:rPr>
+          <w:b w:val="off"/>
+          <w:sz w:val="22"/>
+        </w:rPr>
+        <w:t>Fitiavana - Tanindrazana - Fandrosoana</w:t>
+      </w:r>
+    </w:p>
+    <w:p>
+      <w:pPr>
+        <w:spacing w:after="120"/>
+        <w:jc w:val="center"/>
+      </w:pPr>
+      <w:r>
+        <w:rPr>
+          <w:b w:val="off"/>
+          <w:sz w:val="22"/>
+        </w:rPr>
         <w:t>{{B01-AC-01}}</w:t>
       </w:r>
     </w:p>
@@ -38,6 +64,32 @@
           <w:b w:val="off"/>
           <w:sz w:val="22"/>
         </w:rPr>
+        <w:t>LA PERSONNE RESPONSABLE DES MARCHES PUBLICS</w:t>
+      </w:r>
+    </w:p>
+    <w:p>
+      <w:pPr>
+        <w:spacing w:after="120"/>
+        <w:jc w:val="center"/>
+      </w:pPr>
+      <w:r>
+        <w:rPr>
+          <w:b w:val="off"/>
+          <w:sz w:val="22"/>
+        </w:rPr>
+        <w:t>UNITE DE GESTION DE PASSATION DES MARCHES PUBLICS</w:t>
+      </w:r>
+    </w:p>
+    <w:p>
+      <w:pPr>
+        <w:spacing w:after="120"/>
+        <w:jc w:val="center"/>
+      </w:pPr>
+      <w:r>
+        <w:rPr>
+          <w:b w:val="off"/>
+          <w:sz w:val="22"/>
+        </w:rPr>
         <w:t>Avis d’Appel d’Offres Ouvert</w:t>
       </w:r>
     </w:p>
@@ -64,7 +116,7 @@
           <w:b w:val="off"/>
           <w:sz w:val="22"/>
         </w:rPr>
-        <w:t>{{B02-OB-03}} — {{B02-OB-01}}</w:t>
+        <w:t>N° {{B02-OB-03}}</w:t>
       </w:r>
     </w:p>
     <w:p>
@@ -103,7 +155,7 @@
           <w:b w:val="off"/>
           <w:sz w:val="22"/>
         </w:rPr>
-        <w:t>{{B02-OE-01}} — {{B02-OB-01}}</w:t>
+        <w:t>N° {{B02-OE-01}}</w:t>
       </w:r>
     </w:p>
     <w:p>
@@ -122,27 +174,79 @@
     <w:p>
       <w:pPr>
         <w:spacing w:after="120"/>
-        <w:jc w:val="center"/>
-      </w:pPr>
-      <w:r>
-        <w:rPr>
-          <w:b w:val="off"/>
-          <w:sz w:val="22"/>
-        </w:rPr>
-        <w:t>{{AVIS.date-publication}}</w:t>
-      </w:r>
-    </w:p>
-    <w:p>
-      <w:pPr>
-        <w:spacing w:after="120"/>
-        <w:jc w:val="both"/>
-      </w:pPr>
-      <w:r>
-        <w:rPr>
-          <w:b w:val="off"/>
-          <w:sz w:val="22"/>
-        </w:rPr>
-        <w:t>Cet Avis spécifique d’Appel d’Offres Ouvert fait suite à l’Avis Général de Passation des Marchés publié dans le Journal des Marchés Publics n°{{AVIS.jmp-numero}} en date du {{AVIS.jmp-date}} et dans {{AVIS.supports}}.</w:t>
+        <w:jc w:val="both"/>
+      </w:pPr>
+      <w:r>
+        <w:rPr>
+          <w:b w:val="off"/>
+          <w:sz w:val="22"/>
+        </w:rPr>
+        <w:t>{{SI:SUPPORTS}}</w:t>
+      </w:r>
+    </w:p>
+    <w:p>
+      <w:pPr>
+        <w:spacing w:after="120"/>
+        <w:jc w:val="both"/>
+      </w:pPr>
+      <w:r>
+        <w:rPr>
+          <w:b w:val="off"/>
+          <w:sz w:val="22"/>
+        </w:rPr>
+        <w:t>{{NUM}} Cet Avis spécifique d’Appel d’Offres Ouvert fait suite à l’Avis Général de Passation des Marchés publié dans le Journal des Marchés Publics n°{{AVIS.jmp-numero}} en date du {{AVIS.jmp-date}} et dans {{AVIS.supports}}.</w:t>
+      </w:r>
+    </w:p>
+    <w:p>
+      <w:pPr>
+        <w:spacing w:after="120"/>
+        <w:jc w:val="both"/>
+      </w:pPr>
+      <w:r>
+        <w:rPr>
+          <w:b w:val="off"/>
+          <w:sz w:val="22"/>
+        </w:rPr>
+        <w:t>{{FINSI:SUPPORTS}}</w:t>
+      </w:r>
+    </w:p>
+    <w:p>
+      <w:pPr>
+        <w:spacing w:after="120"/>
+        <w:jc w:val="both"/>
+      </w:pPr>
+      <w:r>
+        <w:rPr>
+          <w:b w:val="off"/>
+          <w:sz w:val="22"/>
+        </w:rPr>
+        <w:t>{{SI:SANS-SUPPORTS}}</w:t>
+      </w:r>
+    </w:p>
+    <w:p>
+      <w:pPr>
+        <w:spacing w:after="120"/>
+        <w:jc w:val="both"/>
+      </w:pPr>
+      <w:r>
+        <w:rPr>
+          <w:b w:val="off"/>
+          <w:sz w:val="22"/>
+        </w:rPr>
+        <w:t>{{NUM}} Cet Avis spécifique d’Appel d’Offres Ouvert fait suite à l’Avis Général de Passation des Marchés publié dans le Journal des Marchés Publics n°{{AVIS.jmp-numero}} en date du {{AVIS.jmp-date}}.</w:t>
+      </w:r>
+    </w:p>
+    <w:p>
+      <w:pPr>
+        <w:spacing w:after="120"/>
+        <w:jc w:val="both"/>
+      </w:pPr>
+      <w:r>
+        <w:rPr>
+          <w:b w:val="off"/>
+          <w:sz w:val="22"/>
+        </w:rPr>
+        <w:t>{{FINSI:SANS-SUPPORTS}}</w:t>
       </w:r>
     </w:p>
     <w:p>
@@ -168,7 +272,7 @@
           <w:b w:val="off"/>
           <w:sz w:val="22"/>
         </w:rPr>
-        <w:t>Le {{B01-AC-01}} sollicite de la part des candidats intéressés des offres sous plis fermés pour fournir {{B02-OB-01}}. Les fournitures sont réparties en {{B02-LV-01}} lots. Le (ou les) candidat(s) peut (ou peuvent) soumissionner pour un ou plusieurs lots.</w:t>
+        <w:t>{{NUM}} Le {{B01-AC-01}} sollicite de la part des candidats intéressés des offres sous plis fermés pour fournir « {{B02-OB-01}} ». Les fournitures sont réparties en {{B02-LV-01}} lots. Le (ou les) candidat(s) peut (ou peuvent) soumissionner pour un ou plusieurs lots.</w:t>
       </w:r>
     </w:p>
     <w:p>
@@ -207,7 +311,7 @@
           <w:b w:val="off"/>
           <w:sz w:val="22"/>
         </w:rPr>
-        <w:t>Le {{B01-AC-01}} sollicite de la part des candidats intéressés des offres sous plis fermés pour fournir {{B02-OB-01}}. Les fournitures constituent un lot unique indivisible. Ainsi, toute offre partielle n’est pas recevable.</w:t>
+        <w:t>{{NUM}} Le {{B01-AC-01}} sollicite de la part des candidats intéressés des offres sous plis fermés pour fournir « {{B02-OB-01}} ». Les fournitures constituent un lot unique indivisible. Ainsi, toute offre partielle n’est pas recevable.</w:t>
       </w:r>
     </w:p>
     <w:p>
@@ -246,7 +350,7 @@
           <w:b w:val="off"/>
           <w:sz w:val="22"/>
         </w:rPr>
-        <w:t>Le {{B01-AC-01}} sollicite de la part des candidats intéressés des offres et des candidatures sous plis fermés pour fournir {{B02-OB-01}}. Les fournitures sont réparties en {{B02-LV-01}} lots. Le (ou les) candidat(s) peut (ou peuvent) soumissionner pour un ou plusieurs lots.</w:t>
+        <w:t>{{NUM}} Le {{B01-AC-01}} sollicite de la part des candidats intéressés des offres et des candidatures sous plis fermés pour fournir « {{B02-OB-01}} ». Les fournitures sont réparties en {{B02-LV-01}} lots. Le (ou les) candidat(s) peut (ou peuvent) soumissionner pour un ou plusieurs lots.</w:t>
       </w:r>
     </w:p>
     <w:p>
@@ -285,7 +389,7 @@
           <w:b w:val="off"/>
           <w:sz w:val="22"/>
         </w:rPr>
-        <w:t>Le {{B01-AC-01}} sollicite de la part des candidats intéressés des offres et des candidatures sous plis fermés pour fournir {{B02-OB-01}}. Les fournitures constituent un lot unique indivisible. Ainsi, toute offre partielle n’est pas recevable.</w:t>
+        <w:t>{{NUM}} Le {{B01-AC-01}} sollicite de la part des candidats intéressés des offres et des candidatures sous plis fermés pour fournir « {{B02-OB-01}} ». Les fournitures constituent un lot unique indivisible. Ainsi, toute offre partielle n’est pas recevable.</w:t>
       </w:r>
     </w:p>
     <w:p>
@@ -324,7 +428,7 @@
           <w:b w:val="off"/>
           <w:sz w:val="22"/>
         </w:rPr>
-        <w:t>La procédure de passation de marché applicable est l’Appel d’Offres Ouvert tel qu’il est défini dans la loi N°2016-055 du 25 Janvier 2017 portant Code des Marchés Publics en ses articles 30, 35 et 67 en vue de la passation de marché à quantités fixes conclu à prix unitaire.</w:t>
+        <w:t>{{NUM}} La procédure de passation de marché applicable est l’Appel d’Offres Ouvert tel qu’il est défini dans la loi N°2016-055 du 25 Janvier 2017 portant Code des Marchés Publics en ses articles 30, 35 et 67 en vue de la passation de marché « à quantités fixes » conclu à prix unitaire.</w:t>
       </w:r>
     </w:p>
     <w:p>
@@ -363,7 +467,7 @@
           <w:b w:val="off"/>
           <w:sz w:val="22"/>
         </w:rPr>
-        <w:t>La procédure de passation de marché applicable est l’Appel d’Offres Ouvert tel qu’il est défini dans la loi N°2016-055 du 25 Janvier 2017 portant Code des Marchés Publics en ses articles 30, 35 et 67 en vue de la passation de marché à quantités fixes conclu à prix forfaitaire.</w:t>
+        <w:t>{{NUM}} La procédure de passation de marché applicable est l’Appel d’Offres Ouvert tel qu’il est défini dans la loi N°2016-055 du 25 Janvier 2017 portant Code des Marchés Publics en ses articles 30, 35 et 67 en vue de la passation de marché « à quantités fixes » conclu à prix forfaitaire.</w:t>
       </w:r>
     </w:p>
     <w:p>
@@ -402,7 +506,7 @@
           <w:b w:val="off"/>
           <w:sz w:val="22"/>
         </w:rPr>
-        <w:t>La procédure de passation de marché applicable est l’Appel d’Offres Ouvert tel qu’il est défini dans la loi N°2016-055 du 25 Janvier 2017 portant Code des Marchés Publics en ses articles 30, 35 et 67 en vue de la passation de marché à commandes conclu à prix unitaire.</w:t>
+        <w:t>{{NUM}} La procédure de passation de marché applicable est l’Appel d’Offres Ouvert tel qu’il est défini dans la loi N°2016-055 du 25 Janvier 2017 portant Code des Marchés Publics en ses articles 30, 35 et 67 en vue de la passation de marché « à commandes » conclu à prix unitaire.</w:t>
       </w:r>
     </w:p>
     <w:p>
@@ -441,7 +545,7 @@
           <w:b w:val="off"/>
           <w:sz w:val="22"/>
         </w:rPr>
-        <w:t>La procédure de passation de marché applicable est l’Appel d’Offres Ouvert tel qu’il est défini dans la loi N°2016-055 du 25 Janvier 2017 portant Code des Marchés Publics en ses articles 30, 35 et 67 en vue de la passation de marché à commandes conclu à prix forfaitaire.</w:t>
+        <w:t>{{NUM}} La procédure de passation de marché applicable est l’Appel d’Offres Ouvert tel qu’il est défini dans la loi N°2016-055 du 25 Janvier 2017 portant Code des Marchés Publics en ses articles 30, 35 et 67 en vue de la passation de marché « à commandes » conclu à prix forfaitaire.</w:t>
       </w:r>
     </w:p>
     <w:p>
@@ -480,7 +584,7 @@
           <w:b w:val="off"/>
           <w:sz w:val="22"/>
         </w:rPr>
-        <w:t>La procédure de passation de marché applicable est l’Appel d’Offres Ouvert tel qu’il est défini dans la loi N°2016-055 du 25 Janvier 2017 portant Code des Marchés Publics en ses articles 30, 35 et 67 en vue de la passation de marché contrat-cadre conclu à prix unitaire.</w:t>
+        <w:t>{{NUM}} La procédure de passation de marché applicable est l’Appel d’Offres Ouvert tel qu’il est défini dans la loi N°2016-055 du 25 Janvier 2017 portant Code des Marchés Publics en ses articles 30, 35 et 67 en vue de la passation de marché « contrat-cadre » conclu à prix unitaire.</w:t>
       </w:r>
     </w:p>
     <w:p>
@@ -519,7 +623,7 @@
           <w:b w:val="off"/>
           <w:sz w:val="22"/>
         </w:rPr>
-        <w:t>La procédure de passation de marché applicable est l’Appel d’Offres Ouvert tel qu’il est défini dans la loi N°2016-055 du 25 Janvier 2017 portant Code des Marchés Publics en ses articles 30, 35 et 67 en vue de la passation de marché contrat-cadre conclu à prix forfaitaire.</w:t>
+        <w:t>{{NUM}} La procédure de passation de marché applicable est l’Appel d’Offres Ouvert tel qu’il est défini dans la loi N°2016-055 du 25 Janvier 2017 portant Code des Marchés Publics en ses articles 30, 35 et 67 en vue de la passation de marché « contrat-cadre » conclu à prix forfaitaire.</w:t>
       </w:r>
     </w:p>
     <w:p>
@@ -545,46 +649,46 @@
           <w:b w:val="off"/>
           <w:sz w:val="22"/>
         </w:rPr>
-        <w:t>Le Dossier d’Appel d’Offres complet, rédigé en langue française, peut être consulté par tout candidat désirant prendre connaissance ou obtenir des informations à l’adresse ci-après :</w:t>
-      </w:r>
-    </w:p>
-    <w:p>
-      <w:pPr>
-        <w:spacing w:after="120"/>
-        <w:jc w:val="both"/>
-      </w:pPr>
-      <w:r>
-        <w:rPr>
-          <w:b w:val="off"/>
-          <w:sz w:val="22"/>
-        </w:rPr>
-        <w:t>{{B04-DS-07}}</w:t>
-      </w:r>
-    </w:p>
-    <w:p>
-      <w:pPr>
-        <w:spacing w:after="120"/>
-        <w:jc w:val="both"/>
-      </w:pPr>
-      <w:r>
-        <w:rPr>
-          <w:b w:val="off"/>
-          <w:sz w:val="22"/>
-        </w:rPr>
-        <w:t>{{B04-DS-08}}</w:t>
-      </w:r>
-    </w:p>
-    <w:p>
-      <w:pPr>
-        <w:spacing w:after="120"/>
-        <w:jc w:val="both"/>
-      </w:pPr>
-      <w:r>
-        <w:rPr>
-          <w:b w:val="off"/>
-          <w:sz w:val="22"/>
-        </w:rPr>
-        <w:t>{{B04-DS-09}}, {{B04-DS-10}}</w:t>
+        <w:t>{{NUM}} Le Dossier d’Appel d’Offres complet, rédigé en langue française, peut être consulté par tout candidat désirant prendre connaissance ou obtenir des informations à l’adresse ci-après :</w:t>
+      </w:r>
+    </w:p>
+    <w:p>
+      <w:pPr>
+        <w:spacing w:after="120"/>
+        <w:jc w:val="both"/>
+      </w:pPr>
+      <w:r>
+        <w:rPr>
+          <w:b w:val="off"/>
+          <w:sz w:val="22"/>
+        </w:rPr>
+        <w:t>- Nom du Responsable : {{B04-DS-07}}</w:t>
+      </w:r>
+    </w:p>
+    <w:p>
+      <w:pPr>
+        <w:spacing w:after="120"/>
+        <w:jc w:val="both"/>
+      </w:pPr>
+      <w:r>
+        <w:rPr>
+          <w:b w:val="off"/>
+          <w:sz w:val="22"/>
+        </w:rPr>
+        <w:t>- Fonction : {{B04-DS-08}}</w:t>
+      </w:r>
+    </w:p>
+    <w:p>
+      <w:pPr>
+        <w:spacing w:after="120"/>
+        <w:jc w:val="both"/>
+      </w:pPr>
+      <w:r>
+        <w:rPr>
+          <w:b w:val="off"/>
+          <w:sz w:val="22"/>
+        </w:rPr>
+        <w:t>- Adresse : {{B04-DS-09}}, {{B04-DS-10}}</w:t>
       </w:r>
     </w:p>
     <w:p>
@@ -610,7 +714,7 @@
           <w:b w:val="off"/>
           <w:sz w:val="22"/>
         </w:rPr>
-        <w:t>{{B04-DS-11}}</w:t>
+        <w:t>- E-mail : {{B04-DS-11}}</w:t>
       </w:r>
     </w:p>
     <w:p>
@@ -636,7 +740,72 @@
           <w:b w:val="off"/>
           <w:sz w:val="22"/>
         </w:rPr>
-        <w:t>Pour le (ou les) candidat(s) désirant soumissionner, le Dossier d’Appel d’Offres doit être retiré auprès de l’Autorité contractante moyennant le paiement d’un montant non remboursable de :</w:t>
+        <w:t>{{NUM}} Pour le (ou les) candidat(s) désirant soumissionner, le Dossier d’Appel d’Offres doit être retiré auprès de {{B01-AC-01}} moyennant le paiement d’un montant non remboursable de :</w:t>
+      </w:r>
+    </w:p>
+    <w:p>
+      <w:pPr>
+        <w:spacing w:after="120"/>
+        <w:jc w:val="both"/>
+      </w:pPr>
+      <w:r>
+        <w:rPr>
+          <w:b w:val="off"/>
+          <w:sz w:val="22"/>
+        </w:rPr>
+        <w:t>{{SI:DAO-LOTS}}</w:t>
+      </w:r>
+    </w:p>
+    <w:p>
+      <w:pPr>
+        <w:spacing w:after="120"/>
+        <w:jc w:val="both"/>
+      </w:pPr>
+      <w:r>
+        <w:rPr>
+          <w:b w:val="off"/>
+          <w:sz w:val="22"/>
+        </w:rPr>
+        <w:t>{{B04-DS-05.lignesParLot}}</w:t>
+      </w:r>
+    </w:p>
+    <w:p>
+      <w:pPr>
+        <w:spacing w:after="120"/>
+        <w:jc w:val="both"/>
+      </w:pPr>
+      <w:r>
+        <w:rPr>
+          <w:b w:val="off"/>
+          <w:sz w:val="22"/>
+        </w:rPr>
+        <w:t>ou son équivalent en monnaie librement convertible libellé au nom de l’Agent comptable de l’ARMP ou au nom du régisseur de recettes de l’ARMP.</w:t>
+      </w:r>
+    </w:p>
+    <w:p>
+      <w:pPr>
+        <w:spacing w:after="120"/>
+        <w:jc w:val="both"/>
+      </w:pPr>
+      <w:r>
+        <w:rPr>
+          <w:b w:val="off"/>
+          <w:sz w:val="22"/>
+        </w:rPr>
+        <w:t>{{FINSI:DAO-LOTS}}</w:t>
+      </w:r>
+    </w:p>
+    <w:p>
+      <w:pPr>
+        <w:spacing w:after="120"/>
+        <w:jc w:val="both"/>
+      </w:pPr>
+      <w:r>
+        <w:rPr>
+          <w:b w:val="off"/>
+          <w:sz w:val="22"/>
+        </w:rPr>
+        <w:t>{{SI:DAO-UNIQUE}}</w:t>
       </w:r>
     </w:p>
     <w:p>
@@ -662,6 +831,19 @@
           <w:b w:val="off"/>
           <w:sz w:val="22"/>
         </w:rPr>
+        <w:t>{{FINSI:DAO-UNIQUE}}</w:t>
+      </w:r>
+    </w:p>
+    <w:p>
+      <w:pPr>
+        <w:spacing w:after="120"/>
+        <w:jc w:val="both"/>
+      </w:pPr>
+      <w:r>
+        <w:rPr>
+          <w:b w:val="off"/>
+          <w:sz w:val="22"/>
+        </w:rPr>
         <w:t>{{SI:ORDINAIRE}}</w:t>
       </w:r>
     </w:p>
@@ -675,7 +857,7 @@
           <w:b w:val="off"/>
           <w:sz w:val="22"/>
         </w:rPr>
-        <w:t>Les plis devront parvenir à {{B04-LR-02}} au plus tard le {{B04-LR-03}}, {{B04-LR-04}} et seront ouverts immédiatement après l’heure limite de remise des offres en présence des candidats ou leurs représentants qui souhaitent y assister. Les offres hors délai ne seront pas recevables.</w:t>
+        <w:t>{{NUM}} Les plis devront parvenir à {{B04-LR-02}} au plus tard le {{B04-LR-03}}, {{B04-LR-04}} et seront ouverts immédiatement après l’heure limite de remise des offres en présence des candidats ou leurs représentants qui souhaitent y assister. Les offres hors délai ne seront pas recevables.</w:t>
       </w:r>
     </w:p>
     <w:p>
@@ -714,7 +896,7 @@
           <w:b w:val="off"/>
           <w:sz w:val="22"/>
         </w:rPr>
-        <w:t>Les plis devront parvenir à {{B04-RQ-03}} au plus tard le {{B04-CP-02}} et seront ouverts immédiatement après l’heure limite de remise des offres en présence des candidats ou leurs représentants qui souhaitent y assister. Les offres hors délai ne seront pas recevables.</w:t>
+        <w:t>{{NUM}} Les plis devront parvenir à {{B04-RQ-03}} au plus tard le {{B04-CP-02.heureLocale}} et seront ouverts immédiatement après l’heure limite de remise des offres en présence des candidats ou leurs représentants qui souhaitent y assister. Les offres hors délai ne seront pas recevables.</w:t>
       </w:r>
     </w:p>
     <w:p>
@@ -753,7 +935,7 @@
           <w:b w:val="off"/>
           <w:sz w:val="22"/>
         </w:rPr>
-        <w:t>La soumission des offres par voie électronique sera autorisée.</w:t>
+        <w:t>{{NUM}} La soumission des offres par voie électronique sera autorisée.</w:t>
       </w:r>
     </w:p>
     <w:p>
@@ -792,7 +974,7 @@
           <w:b w:val="off"/>
           <w:sz w:val="22"/>
         </w:rPr>
-        <w:t>La soumission des offres par voie électronique ne sera pas autorisée.</w:t>
+        <w:t>{{NUM}} La soumission des offres par voie électronique ne sera pas autorisée.</w:t>
       </w:r>
     </w:p>
     <w:p>
@@ -831,7 +1013,7 @@
           <w:b w:val="off"/>
           <w:sz w:val="22"/>
         </w:rPr>
-        <w:t>Chaque offre doit être accompagnée d’une garantie de soumission d’un montant de {{B05-GS-03.parLot}}, ou son équivalent en monnaie librement convertible, elle doit être présentée sous l’une des formes suivantes : soit par caution personnelle et solidaire d’un organisme agréé par le Ministère chargée des Finances, soit par garantie bancaire, soit par chèque de banque.</w:t>
+        <w:t>{{NUM}} Chaque offre doit être accompagnée d’une garantie de soumission d’un montant de {{B05-GS-03.parLot}}, ou son équivalent en monnaie librement convertible, elle doit être présentée sous l’une des formes suivantes : soit par caution personnelle et solidaire d’un organisme agréé par le Ministère chargée des Finances, soit par garantie bancaire, soit par chèque de banque.</w:t>
       </w:r>
     </w:p>
     <w:p>
@@ -870,7 +1052,7 @@
           <w:b w:val="off"/>
           <w:sz w:val="22"/>
         </w:rPr>
-        <w:t>Chaque offre doit être accompagnée d’une garantie de soumission d’un montant de {{B05-GS-03.lettres}} ({{B05-GS-03}}), ou son équivalent en monnaie librement convertible, elle doit être présentée sous l’une des formes suivantes : soit par caution personnelle et solidaire d’un organisme agréé par le Ministère chargée des Finances, soit par garantie bancaire, soit par chèque de banque.</w:t>
+        <w:t>{{NUM}} Chaque offre doit être accompagnée d’une garantie de soumission d’un montant de {{B05-GS-03.lettres}} ({{B05-GS-03}}), ou son équivalent en monnaie librement convertible, elle doit être présentée sous l’une des formes suivantes : soit par caution personnelle et solidaire d’un organisme agréé par le Ministère chargée des Finances, soit par garantie bancaire, soit par chèque de banque.</w:t>
       </w:r>
     </w:p>
     <w:p>
@@ -896,6 +1078,45 @@
           <w:b w:val="off"/>
           <w:sz w:val="22"/>
         </w:rPr>
+        <w:t>{{SI:SANS-GARANTIE}}</w:t>
+      </w:r>
+    </w:p>
+    <w:p>
+      <w:pPr>
+        <w:spacing w:after="120"/>
+        <w:jc w:val="both"/>
+      </w:pPr>
+      <w:r>
+        <w:rPr>
+          <w:b w:val="off"/>
+          <w:sz w:val="22"/>
+        </w:rPr>
+        <w:t>{{NUM}} La garantie de soumission n’est pas requise.</w:t>
+      </w:r>
+    </w:p>
+    <w:p>
+      <w:pPr>
+        <w:spacing w:after="120"/>
+        <w:jc w:val="both"/>
+      </w:pPr>
+      <w:r>
+        <w:rPr>
+          <w:b w:val="off"/>
+          <w:sz w:val="22"/>
+        </w:rPr>
+        <w:t>{{FINSI:SANS-GARANTIE}}</w:t>
+      </w:r>
+    </w:p>
+    <w:p>
+      <w:pPr>
+        <w:spacing w:after="120"/>
+        <w:jc w:val="both"/>
+      </w:pPr>
+      <w:r>
+        <w:rPr>
+          <w:b w:val="off"/>
+          <w:sz w:val="22"/>
+        </w:rPr>
         <w:t>{{SI:CC}}</w:t>
       </w:r>
     </w:p>
@@ -909,7 +1130,7 @@
           <w:b w:val="off"/>
           <w:sz w:val="22"/>
         </w:rPr>
-        <w:t>Les titulaires du contrat-cadre issu du présent appel d’offres seront ultérieurement invités à participer à la passation des marchés subséquents.</w:t>
+        <w:t>{{NUM}} Les titulaires du contrat-cadre issu du présent appel d’offres seront ultérieurement invités à participer à la passation des marchés subséquents.</w:t>
       </w:r>
     </w:p>
     <w:p>
@@ -923,6 +1144,19 @@
           <w:sz w:val="22"/>
         </w:rPr>
         <w:t>{{FINSI:CC}}</w:t>
+      </w:r>
+    </w:p>
+    <w:p>
+      <w:pPr>
+        <w:spacing w:after="120"/>
+        <w:jc w:val="both"/>
+      </w:pPr>
+      <w:r>
+        <w:rPr>
+          <w:b w:val="off"/>
+          <w:sz w:val="22"/>
+        </w:rPr>
+        <w:t>à {{B04-DS-10}}, le {{AVIS.date-publication}}</w:t>
       </w:r>
     </w:p>
     <w:p>

</xml_diff>

<commit_message>
feat(dao): avis specifique — l'embleme en tete ({{IMAGE:embleme}}, image de tete des PV reprise par le serveur), lignes Republique / devise retirees (contenues dans l'image) ; decalques 90/90 et 96/96 ; demande §B7.8
Co-Authored-By: Claude Opus 5.5 (1M context) <noreply@anthropic.com>
</commit_message>
<xml_diff>
--- a/docs/modeles-dao/AVIS-F.docx
+++ b/docs/modeles-dao/AVIS-F.docx
@@ -25,20 +25,7 @@
           <w:b w:val="off"/>
           <w:sz w:val="22"/>
         </w:rPr>
-        <w:t>REPOBLIKAN’I MADAGASIKARA</w:t>
-      </w:r>
-    </w:p>
-    <w:p>
-      <w:pPr>
-        <w:spacing w:after="120"/>
-        <w:jc w:val="center"/>
-      </w:pPr>
-      <w:r>
-        <w:rPr>
-          <w:b w:val="off"/>
-          <w:sz w:val="22"/>
-        </w:rPr>
-        <w:t>Fitiavana - Tanindrazana - Fandrosoana</w:t>
+        <w:t>{{IMAGE:embleme}}</w:t>
       </w:r>
     </w:p>
     <w:p>

</xml_diff>

<commit_message>
feat(dao): avis specifique — prix du DAO a verser sur le compte bancaire unique de l'ARMP ({{PARAM.compte-dao}}, decision du pilote du 01/10) ; demande §B8 (parametre administrable) et §B9 (recette a l'ecran sur la fiche 38 : PV 47 signe FAV, avis imprime, ligne 303121 passee « Lance » ; piece n° 9 « Avis d'appel d'offres » encore exigee au depot) ; espace avant les separateurs de la liste des avis
Co-Authored-By: Claude Opus 5.5 (1M context) <noreply@anthropic.com>
</commit_message>
<xml_diff>
--- a/docs/modeles-dao/AVIS-F.docx
+++ b/docs/modeles-dao/AVIS-F.docx
@@ -766,7 +766,7 @@
           <w:b w:val="off"/>
           <w:sz w:val="22"/>
         </w:rPr>
-        <w:t>ou son équivalent en monnaie librement convertible libellé au nom de l’Agent comptable de l’ARMP ou au nom du régisseur de recettes de l’ARMP.</w:t>
+        <w:t>ou son équivalent en monnaie librement convertible à verser sur le compte bancaire de l’ARMP : {{PARAM.compte-dao}}.</w:t>
       </w:r>
     </w:p>
     <w:p>
@@ -805,7 +805,7 @@
           <w:b w:val="off"/>
           <w:sz w:val="22"/>
         </w:rPr>
-        <w:t>- {{B04-DS-05.lettres}} (Ar {{B04-DS-05.chiffres}}) ou son équivalent en monnaie librement convertible libellé au nom de l’Agent comptable de l’ARMP ou au nom du régisseur de recettes de l’ARMP.</w:t>
+        <w:t>- {{B04-DS-05.lettres}} (Ar {{B04-DS-05.chiffres}}) ou son équivalent en monnaie librement convertible à verser sur le compte bancaire de l’ARMP : {{PARAM.compte-dao}}.</w:t>
       </w:r>
     </w:p>
     <w:p>

</xml_diff>

<commit_message>
feat(dao): suites de la livraison avis §B7-§B8 — titre de l'avis dans le corps sous l'en-tete (plus de ligne TITRE en tete : 89/89 et 96->95), variantes « lot unique » robustes (alloti != OUI), DPAC du contrat-cadre : montant du DAO par lot (184/184) ; verifier.mjs accepte un modele sans titre
Co-Authored-By: Claude Opus 5.5 (1M context) <noreply@anthropic.com>
</commit_message>
<xml_diff>
--- a/docs/modeles-dao/AVIS-F.docx
+++ b/docs/modeles-dao/AVIS-F.docx
@@ -4,6 +4,58 @@
   <w:body>
     <w:p>
       <w:pPr>
+        <w:spacing w:after="120"/>
+        <w:jc w:val="center"/>
+      </w:pPr>
+      <w:r>
+        <w:rPr>
+          <w:b w:val="off"/>
+          <w:sz w:val="22"/>
+        </w:rPr>
+        <w:t>{{IMAGE:embleme}}</w:t>
+      </w:r>
+    </w:p>
+    <w:p>
+      <w:pPr>
+        <w:spacing w:after="120"/>
+        <w:jc w:val="center"/>
+      </w:pPr>
+      <w:r>
+        <w:rPr>
+          <w:b w:val="off"/>
+          <w:sz w:val="22"/>
+        </w:rPr>
+        <w:t>{{B01-AC-01}}</w:t>
+      </w:r>
+    </w:p>
+    <w:p>
+      <w:pPr>
+        <w:spacing w:after="120"/>
+        <w:jc w:val="center"/>
+      </w:pPr>
+      <w:r>
+        <w:rPr>
+          <w:b w:val="off"/>
+          <w:sz w:val="22"/>
+        </w:rPr>
+        <w:t>LA PERSONNE RESPONSABLE DES MARCHES PUBLICS</w:t>
+      </w:r>
+    </w:p>
+    <w:p>
+      <w:pPr>
+        <w:spacing w:after="120"/>
+        <w:jc w:val="center"/>
+      </w:pPr>
+      <w:r>
+        <w:rPr>
+          <w:b w:val="off"/>
+          <w:sz w:val="22"/>
+        </w:rPr>
+        <w:t>UNITE DE GESTION DE PASSATION DES MARCHES PUBLICS</w:t>
+      </w:r>
+    </w:p>
+    <w:p>
+      <w:pPr>
         <w:spacing w:after="240"/>
         <w:jc w:val="center"/>
       </w:pPr>
@@ -11,71 +63,6 @@
         <w:rPr>
           <w:b w:val="on"/>
           <w:sz w:val="26"/>
-        </w:rPr>
-        <w:t>Avis d’Appel d’Offres Ouvert</w:t>
-      </w:r>
-    </w:p>
-    <w:p>
-      <w:pPr>
-        <w:spacing w:after="120"/>
-        <w:jc w:val="center"/>
-      </w:pPr>
-      <w:r>
-        <w:rPr>
-          <w:b w:val="off"/>
-          <w:sz w:val="22"/>
-        </w:rPr>
-        <w:t>{{IMAGE:embleme}}</w:t>
-      </w:r>
-    </w:p>
-    <w:p>
-      <w:pPr>
-        <w:spacing w:after="120"/>
-        <w:jc w:val="center"/>
-      </w:pPr>
-      <w:r>
-        <w:rPr>
-          <w:b w:val="off"/>
-          <w:sz w:val="22"/>
-        </w:rPr>
-        <w:t>{{B01-AC-01}}</w:t>
-      </w:r>
-    </w:p>
-    <w:p>
-      <w:pPr>
-        <w:spacing w:after="120"/>
-        <w:jc w:val="center"/>
-      </w:pPr>
-      <w:r>
-        <w:rPr>
-          <w:b w:val="off"/>
-          <w:sz w:val="22"/>
-        </w:rPr>
-        <w:t>LA PERSONNE RESPONSABLE DES MARCHES PUBLICS</w:t>
-      </w:r>
-    </w:p>
-    <w:p>
-      <w:pPr>
-        <w:spacing w:after="120"/>
-        <w:jc w:val="center"/>
-      </w:pPr>
-      <w:r>
-        <w:rPr>
-          <w:b w:val="off"/>
-          <w:sz w:val="22"/>
-        </w:rPr>
-        <w:t>UNITE DE GESTION DE PASSATION DES MARCHES PUBLICS</w:t>
-      </w:r>
-    </w:p>
-    <w:p>
-      <w:pPr>
-        <w:spacing w:after="120"/>
-        <w:jc w:val="center"/>
-      </w:pPr>
-      <w:r>
-        <w:rPr>
-          <w:b w:val="off"/>
-          <w:sz w:val="22"/>
         </w:rPr>
         <w:t>Avis d’Appel d’Offres Ouvert</w:t>
       </w:r>

</xml_diff>

<commit_message>
chore(dao): modeles DPAC-CC, DPAO-F, DPAO-T, DPIC-PI, AVIS-F, AVIS-T et LETTRE-AOR resynchronises sur le backend 31bfde1 (sections PAPIER / B04-SE, clause 5.2 redigee, seance en ligne, avis aligne), decalques Word regeneres dans docs/modeles-dao, referentiel recopie (champs papier conditionnes, DELAI_QUESTIONS, libelle B04-RC-02) ; motif COMPTE_ARMP_ABSENT nomme dans la carte de l'avis et des lettres
Co-Authored-By: Claude Fable 5.1 <noreply@anthropic.com>
</commit_message>
<xml_diff>
--- a/docs/modeles-dao/AVIS-F.docx
+++ b/docs/modeles-dao/AVIS-F.docx
@@ -389,6 +389,45 @@
           <w:b w:val="off"/>
           <w:sz w:val="22"/>
         </w:rPr>
+        <w:t>{{SI:LOTS-MAX}}</w:t>
+      </w:r>
+    </w:p>
+    <w:p>
+      <w:pPr>
+        <w:spacing w:after="120"/>
+        <w:jc w:val="both"/>
+      </w:pPr>
+      <w:r>
+        <w:rPr>
+          <w:b w:val="off"/>
+          <w:sz w:val="22"/>
+        </w:rPr>
+        <w:t>Un même candidat ne peut se voir attribuer plus de {{B02-AU-07}} lot(s).</w:t>
+      </w:r>
+    </w:p>
+    <w:p>
+      <w:pPr>
+        <w:spacing w:after="120"/>
+        <w:jc w:val="both"/>
+      </w:pPr>
+      <w:r>
+        <w:rPr>
+          <w:b w:val="off"/>
+          <w:sz w:val="22"/>
+        </w:rPr>
+        <w:t>{{FINSI:LOTS-MAX}}</w:t>
+      </w:r>
+    </w:p>
+    <w:p>
+      <w:pPr>
+        <w:spacing w:after="120"/>
+        <w:jc w:val="both"/>
+      </w:pPr>
+      <w:r>
+        <w:rPr>
+          <w:b w:val="off"/>
+          <w:sz w:val="22"/>
+        </w:rPr>
         <w:t>{{SI:QF-UNITAIRES}}</w:t>
       </w:r>
     </w:p>
@@ -623,6 +662,19 @@
           <w:b w:val="off"/>
           <w:sz w:val="22"/>
         </w:rPr>
+        <w:t>{{SI:PAPIER}}</w:t>
+      </w:r>
+    </w:p>
+    <w:p>
+      <w:pPr>
+        <w:spacing w:after="120"/>
+        <w:jc w:val="both"/>
+      </w:pPr>
+      <w:r>
+        <w:rPr>
+          <w:b w:val="off"/>
+          <w:sz w:val="22"/>
+        </w:rPr>
         <w:t>{{NUM}} Le Dossier d’Appel d’Offres complet, rédigé en langue française, peut être consulté par tout candidat désirant prendre connaissance ou obtenir des informations à l’adresse ci-après :</w:t>
       </w:r>
     </w:p>
@@ -714,6 +766,71 @@
           <w:b w:val="off"/>
           <w:sz w:val="22"/>
         </w:rPr>
+        <w:t>{{FINSI:PAPIER}}</w:t>
+      </w:r>
+    </w:p>
+    <w:p>
+      <w:pPr>
+        <w:spacing w:after="120"/>
+        <w:jc w:val="both"/>
+      </w:pPr>
+      <w:r>
+        <w:rPr>
+          <w:b w:val="off"/>
+          <w:sz w:val="22"/>
+        </w:rPr>
+        <w:t>{{SI:ELECTRONIQUE}}</w:t>
+      </w:r>
+    </w:p>
+    <w:p>
+      <w:pPr>
+        <w:spacing w:after="120"/>
+        <w:jc w:val="both"/>
+      </w:pPr>
+      <w:r>
+        <w:rPr>
+          <w:b w:val="off"/>
+          <w:sz w:val="22"/>
+        </w:rPr>
+        <w:t>{{NUM}} Le Dossier d’Appel d’Offres complet, rédigé en langue française, peut être consulté par tout candidat sur la plateforme de dépôt des offres : {{B04-SE-02}}.</w:t>
+      </w:r>
+    </w:p>
+    <w:p>
+      <w:pPr>
+        <w:spacing w:after="120"/>
+        <w:jc w:val="both"/>
+      </w:pPr>
+      <w:r>
+        <w:rPr>
+          <w:b w:val="off"/>
+          <w:sz w:val="22"/>
+        </w:rPr>
+        <w:t>{{FINSI:ELECTRONIQUE}}</w:t>
+      </w:r>
+    </w:p>
+    <w:p>
+      <w:pPr>
+        <w:spacing w:after="120"/>
+        <w:jc w:val="both"/>
+      </w:pPr>
+      <w:r>
+        <w:rPr>
+          <w:b w:val="off"/>
+          <w:sz w:val="22"/>
+        </w:rPr>
+        <w:t>{{SI:PAPIER}}</w:t>
+      </w:r>
+    </w:p>
+    <w:p>
+      <w:pPr>
+        <w:spacing w:after="120"/>
+        <w:jc w:val="both"/>
+      </w:pPr>
+      <w:r>
+        <w:rPr>
+          <w:b w:val="off"/>
+          <w:sz w:val="22"/>
+        </w:rPr>
         <w:t>{{NUM}} Pour le (ou les) candidat(s) désirant soumissionner, le Dossier d’Appel d’Offres doit être retiré auprès de {{B01-AC-01}} moyennant le paiement d’un montant non remboursable de :</w:t>
       </w:r>
     </w:p>
@@ -727,6 +844,58 @@
           <w:b w:val="off"/>
           <w:sz w:val="22"/>
         </w:rPr>
+        <w:t>{{FINSI:PAPIER}}</w:t>
+      </w:r>
+    </w:p>
+    <w:p>
+      <w:pPr>
+        <w:spacing w:after="120"/>
+        <w:jc w:val="both"/>
+      </w:pPr>
+      <w:r>
+        <w:rPr>
+          <w:b w:val="off"/>
+          <w:sz w:val="22"/>
+        </w:rPr>
+        <w:t>{{SI:ELECTRONIQUE}}</w:t>
+      </w:r>
+    </w:p>
+    <w:p>
+      <w:pPr>
+        <w:spacing w:after="120"/>
+        <w:jc w:val="both"/>
+      </w:pPr>
+      <w:r>
+        <w:rPr>
+          <w:b w:val="off"/>
+          <w:sz w:val="22"/>
+        </w:rPr>
+        <w:t>{{NUM}} Pour le (ou les) candidat(s) désirant soumissionner, le Dossier d’Appel d’Offres est retiré sur la plateforme de dépôt des offres, une fois le reçu du versement validé, moyennant le paiement d’un montant non remboursable de :</w:t>
+      </w:r>
+    </w:p>
+    <w:p>
+      <w:pPr>
+        <w:spacing w:after="120"/>
+        <w:jc w:val="both"/>
+      </w:pPr>
+      <w:r>
+        <w:rPr>
+          <w:b w:val="off"/>
+          <w:sz w:val="22"/>
+        </w:rPr>
+        <w:t>{{FINSI:ELECTRONIQUE}}</w:t>
+      </w:r>
+    </w:p>
+    <w:p>
+      <w:pPr>
+        <w:spacing w:after="120"/>
+        <w:jc w:val="both"/>
+      </w:pPr>
+      <w:r>
+        <w:rPr>
+          <w:b w:val="off"/>
+          <w:sz w:val="22"/>
+        </w:rPr>
         <w:t>{{SI:DAO-LOTS}}</w:t>
       </w:r>
     </w:p>
@@ -818,6 +987,19 @@
           <w:b w:val="off"/>
           <w:sz w:val="22"/>
         </w:rPr>
+        <w:t>{{SI:PAPIER}}</w:t>
+      </w:r>
+    </w:p>
+    <w:p>
+      <w:pPr>
+        <w:spacing w:after="120"/>
+        <w:jc w:val="both"/>
+      </w:pPr>
+      <w:r>
+        <w:rPr>
+          <w:b w:val="off"/>
+          <w:sz w:val="22"/>
+        </w:rPr>
         <w:t>{{SI:ORDINAIRE}}</w:t>
       </w:r>
     </w:p>
@@ -896,6 +1078,19 @@
           <w:b w:val="off"/>
           <w:sz w:val="22"/>
         </w:rPr>
+        <w:t>{{FINSI:PAPIER}}</w:t>
+      </w:r>
+    </w:p>
+    <w:p>
+      <w:pPr>
+        <w:spacing w:after="120"/>
+        <w:jc w:val="both"/>
+      </w:pPr>
+      <w:r>
+        <w:rPr>
+          <w:b w:val="off"/>
+          <w:sz w:val="22"/>
+        </w:rPr>
         <w:t>{{SI:ELECTRONIQUE}}</w:t>
       </w:r>
     </w:p>
@@ -909,7 +1104,319 @@
           <w:b w:val="off"/>
           <w:sz w:val="22"/>
         </w:rPr>
-        <w:t>{{NUM}} La soumission des offres par voie électronique sera autorisée.</w:t>
+        <w:t>{{SI:ORDINAIRE}}</w:t>
+      </w:r>
+    </w:p>
+    <w:p>
+      <w:pPr>
+        <w:spacing w:after="120"/>
+        <w:jc w:val="both"/>
+      </w:pPr>
+      <w:r>
+        <w:rPr>
+          <w:b w:val="off"/>
+          <w:sz w:val="22"/>
+        </w:rPr>
+        <w:t>{{NUM}} Les offres sont déposées sur la plateforme de dépôt ({{B04-SE-02}}) au plus tard le {{B04-LR-03}}, {{B04-LR-04}} (heure de référence : {{B04-SE-04}}). Les offres hors délai ne sont pas recevables.</w:t>
+      </w:r>
+    </w:p>
+    <w:p>
+      <w:pPr>
+        <w:spacing w:after="120"/>
+        <w:jc w:val="both"/>
+      </w:pPr>
+      <w:r>
+        <w:rPr>
+          <w:b w:val="off"/>
+          <w:sz w:val="22"/>
+        </w:rPr>
+        <w:t>{{FINSI:ORDINAIRE}}</w:t>
+      </w:r>
+    </w:p>
+    <w:p>
+      <w:pPr>
+        <w:spacing w:after="120"/>
+        <w:jc w:val="both"/>
+      </w:pPr>
+      <w:r>
+        <w:rPr>
+          <w:b w:val="off"/>
+          <w:sz w:val="22"/>
+        </w:rPr>
+        <w:t>{{SI:CC}}</w:t>
+      </w:r>
+    </w:p>
+    <w:p>
+      <w:pPr>
+        <w:spacing w:after="120"/>
+        <w:jc w:val="both"/>
+      </w:pPr>
+      <w:r>
+        <w:rPr>
+          <w:b w:val="off"/>
+          <w:sz w:val="22"/>
+        </w:rPr>
+        <w:t>{{NUM}} Les offres sont déposées sur la plateforme de dépôt ({{B04-SE-02}}) au plus tard le {{B04-CP-02.heureLocale}} (heure de référence : {{B04-SE-04}}). Les offres hors délai ne sont pas recevables.</w:t>
+      </w:r>
+    </w:p>
+    <w:p>
+      <w:pPr>
+        <w:spacing w:after="120"/>
+        <w:jc w:val="both"/>
+      </w:pPr>
+      <w:r>
+        <w:rPr>
+          <w:b w:val="off"/>
+          <w:sz w:val="22"/>
+        </w:rPr>
+        <w:t>{{FINSI:CC}}</w:t>
+      </w:r>
+    </w:p>
+    <w:p>
+      <w:pPr>
+        <w:spacing w:after="120"/>
+        <w:jc w:val="both"/>
+      </w:pPr>
+      <w:r>
+        <w:rPr>
+          <w:b w:val="off"/>
+          <w:sz w:val="22"/>
+        </w:rPr>
+        <w:t>{{SI:SE-OUVERTURE}}</w:t>
+      </w:r>
+    </w:p>
+    <w:p>
+      <w:pPr>
+        <w:spacing w:after="120"/>
+        <w:jc w:val="both"/>
+      </w:pPr>
+      <w:r>
+        <w:rPr>
+          <w:b w:val="off"/>
+          <w:sz w:val="22"/>
+        </w:rPr>
+        <w:t>Les dépôts sont ouverts à compter du {{B04-SE-03}}.</w:t>
+      </w:r>
+    </w:p>
+    <w:p>
+      <w:pPr>
+        <w:spacing w:after="120"/>
+        <w:jc w:val="both"/>
+      </w:pPr>
+      <w:r>
+        <w:rPr>
+          <w:b w:val="off"/>
+          <w:sz w:val="22"/>
+        </w:rPr>
+        <w:t>{{FINSI:SE-OUVERTURE}}</w:t>
+      </w:r>
+    </w:p>
+    <w:p>
+      <w:pPr>
+        <w:spacing w:after="120"/>
+        <w:jc w:val="both"/>
+      </w:pPr>
+      <w:r>
+        <w:rPr>
+          <w:b w:val="off"/>
+          <w:sz w:val="22"/>
+        </w:rPr>
+        <w:t>Les offres sont ouvertes en séance, après l’heure limite de remise des offres.</w:t>
+      </w:r>
+    </w:p>
+    <w:p>
+      <w:pPr>
+        <w:spacing w:after="120"/>
+        <w:jc w:val="both"/>
+      </w:pPr>
+      <w:r>
+        <w:rPr>
+          <w:b w:val="off"/>
+          <w:sz w:val="22"/>
+        </w:rPr>
+        <w:t>{{SI:OP-DELAI}}</w:t>
+      </w:r>
+    </w:p>
+    <w:p>
+      <w:pPr>
+        <w:spacing w:after="120"/>
+        <w:jc w:val="both"/>
+      </w:pPr>
+      <w:r>
+        <w:rPr>
+          <w:b w:val="off"/>
+          <w:sz w:val="22"/>
+        </w:rPr>
+        <w:t>La séance d’ouverture se tient {{B04-OP-12}} minutes après l’heure limite de remise des offres.</w:t>
+      </w:r>
+    </w:p>
+    <w:p>
+      <w:pPr>
+        <w:spacing w:after="120"/>
+        <w:jc w:val="both"/>
+      </w:pPr>
+      <w:r>
+        <w:rPr>
+          <w:b w:val="off"/>
+          <w:sz w:val="22"/>
+        </w:rPr>
+        <w:t>{{FINSI:OP-DELAI}}</w:t>
+      </w:r>
+    </w:p>
+    <w:p>
+      <w:pPr>
+        <w:spacing w:after="120"/>
+        <w:jc w:val="both"/>
+      </w:pPr>
+      <w:r>
+        <w:rPr>
+          <w:b w:val="off"/>
+          <w:sz w:val="22"/>
+        </w:rPr>
+        <w:t>{{SI:OP-MODALITE}}</w:t>
+      </w:r>
+    </w:p>
+    <w:p>
+      <w:pPr>
+        <w:spacing w:after="120"/>
+        <w:jc w:val="both"/>
+      </w:pPr>
+      <w:r>
+        <w:rPr>
+          <w:b w:val="off"/>
+          <w:sz w:val="22"/>
+        </w:rPr>
+        <w:t>Modalité de la séance : {{B04-OP-10}}.</w:t>
+      </w:r>
+    </w:p>
+    <w:p>
+      <w:pPr>
+        <w:spacing w:after="120"/>
+        <w:jc w:val="both"/>
+      </w:pPr>
+      <w:r>
+        <w:rPr>
+          <w:b w:val="off"/>
+          <w:sz w:val="22"/>
+        </w:rPr>
+        <w:t>{{FINSI:OP-MODALITE}}</w:t>
+      </w:r>
+    </w:p>
+    <w:p>
+      <w:pPr>
+        <w:spacing w:after="120"/>
+        <w:jc w:val="both"/>
+      </w:pPr>
+      <w:r>
+        <w:rPr>
+          <w:b w:val="off"/>
+          <w:sz w:val="22"/>
+        </w:rPr>
+        <w:t>{{SI:OP-LIEN}}</w:t>
+      </w:r>
+    </w:p>
+    <w:p>
+      <w:pPr>
+        <w:spacing w:after="120"/>
+        <w:jc w:val="both"/>
+      </w:pPr>
+      <w:r>
+        <w:rPr>
+          <w:b w:val="off"/>
+          <w:sz w:val="22"/>
+        </w:rPr>
+        <w:t>Les soumissionnaires peuvent suivre la séance à l’adresse suivante : {{B04-OP-11}}.</w:t>
+      </w:r>
+    </w:p>
+    <w:p>
+      <w:pPr>
+        <w:spacing w:after="120"/>
+        <w:jc w:val="both"/>
+      </w:pPr>
+      <w:r>
+        <w:rPr>
+          <w:b w:val="off"/>
+          <w:sz w:val="22"/>
+        </w:rPr>
+        <w:t>{{FINSI:OP-LIEN}}</w:t>
+      </w:r>
+    </w:p>
+    <w:p>
+      <w:pPr>
+        <w:spacing w:after="120"/>
+        <w:jc w:val="both"/>
+      </w:pPr>
+      <w:r>
+        <w:rPr>
+          <w:b w:val="off"/>
+          <w:sz w:val="22"/>
+        </w:rPr>
+        <w:t>{{SI:OP-PV}}</w:t>
+      </w:r>
+    </w:p>
+    <w:p>
+      <w:pPr>
+        <w:spacing w:after="120"/>
+        <w:jc w:val="both"/>
+      </w:pPr>
+      <w:r>
+        <w:rPr>
+          <w:b w:val="off"/>
+          <w:sz w:val="22"/>
+        </w:rPr>
+        <w:t>Le procès-verbal de la séance est publié sur la plateforme.</w:t>
+      </w:r>
+    </w:p>
+    <w:p>
+      <w:pPr>
+        <w:spacing w:after="120"/>
+        <w:jc w:val="both"/>
+      </w:pPr>
+      <w:r>
+        <w:rPr>
+          <w:b w:val="off"/>
+          <w:sz w:val="22"/>
+        </w:rPr>
+        <w:t>{{FINSI:OP-PV}}</w:t>
+      </w:r>
+    </w:p>
+    <w:p>
+      <w:pPr>
+        <w:spacing w:after="120"/>
+        <w:jc w:val="both"/>
+      </w:pPr>
+      <w:r>
+        <w:rPr>
+          <w:b w:val="off"/>
+          <w:sz w:val="22"/>
+        </w:rPr>
+        <w:t>{{FINSI:ELECTRONIQUE}}</w:t>
+      </w:r>
+    </w:p>
+    <w:p>
+      <w:pPr>
+        <w:spacing w:after="120"/>
+        <w:jc w:val="both"/>
+      </w:pPr>
+      <w:r>
+        <w:rPr>
+          <w:b w:val="off"/>
+          <w:sz w:val="22"/>
+        </w:rPr>
+        <w:t>{{SI:ELECTRONIQUE}}</w:t>
+      </w:r>
+    </w:p>
+    <w:p>
+      <w:pPr>
+        <w:spacing w:after="120"/>
+        <w:jc w:val="both"/>
+      </w:pPr>
+      <w:r>
+        <w:rPr>
+          <w:b w:val="off"/>
+          <w:sz w:val="22"/>
+        </w:rPr>
+        <w:t>{{NUM}} La remise des offres se fait exclusivement par voie électronique, sur la plateforme de dépôt : {{B04-SE-02}}.</w:t>
       </w:r>
     </w:p>
     <w:p>

</xml_diff>